<commit_message>
Add student name and university to front page, support logo image
Co-Authored-By: Claude Opus 5.5 <noreply@anthropic.com>
Claude-Session: https://claude.ai/code/session_015FzNpWvVcgtCUNTKwZzDr2
</commit_message>
<xml_diff>
--- a/lab2_report/ITE408_Lab2_Report_1093911.docx
+++ b/lab2_report/ITE408_Lab2_Report_1093911.docx
@@ -14,7 +14,7 @@
           <w:b/>
           <w:sz w:val="36"/>
         </w:rPr>
-        <w:t>[University Name]</w:t>
+        <w:t>Abu Dhabi University</w:t>
       </w:r>
     </w:p>
     <w:p>
@@ -136,7 +136,7 @@
           </w:tcPr>
           <w:p>
             <w:r>
-              <w:t>[Your Full Name]</w:t>
+              <w:t>Mezrait Menber</w:t>
             </w:r>
           </w:p>
         </w:tc>

</xml_diff>

<commit_message>
Add ADU logo to front page
Co-Authored-By: Claude Opus 5.5 <noreply@anthropic.com>
Claude-Session: https://claude.ai/code/session_015FzNpWvVcgtCUNTKwZzDr2
</commit_message>
<xml_diff>
--- a/lab2_report/ITE408_Lab2_Report_1093911.docx
+++ b/lab2_report/ITE408_Lab2_Report_1093911.docx
@@ -2,30 +2,43 @@
 <file path=word/document.xml><?xml version="1.0" encoding="utf-8"?>
 <w:document xmlns:wpc="http://schemas.microsoft.com/office/word/2010/wordprocessingCanvas" xmlns:mo="http://schemas.microsoft.com/office/mac/office/2008/main" xmlns:mc="http://schemas.openxmlformats.org/markup-compatibility/2006" xmlns:mv="urn:schemas-microsoft-com:mac:vml" xmlns:o="urn:schemas-microsoft-com:office:office" xmlns:r="http://schemas.openxmlformats.org/officeDocument/2006/relationships" xmlns:m="http://schemas.openxmlformats.org/officeDocument/2006/math" xmlns:v="urn:schemas-microsoft-com:vml" xmlns:wp14="http://schemas.microsoft.com/office/word/2010/wordprocessingDrawing" xmlns:wp="http://schemas.openxmlformats.org/drawingml/2006/wordprocessingDrawing" xmlns:w10="urn:schemas-microsoft-com:office:word" xmlns:w="http://schemas.openxmlformats.org/wordprocessingml/2006/main" xmlns:w14="http://schemas.microsoft.com/office/word/2010/wordml" xmlns:wpg="http://schemas.microsoft.com/office/word/2010/wordprocessingGroup" xmlns:wpi="http://schemas.microsoft.com/office/word/2010/wordprocessingInk" xmlns:wne="http://schemas.microsoft.com/office/word/2006/wordml" xmlns:wps="http://schemas.microsoft.com/office/word/2010/wordprocessingShape" mc:Ignorable="w14 wp14">
   <w:body>
-    <w:p/>
-    <w:p/>
-    <w:p/>
     <w:p>
       <w:pPr>
         <w:jc w:val="center"/>
       </w:pPr>
       <w:r>
-        <w:rPr>
-          <w:b/>
-          <w:sz w:val="36"/>
-        </w:rPr>
-        <w:t>Abu Dhabi University</w:t>
-      </w:r>
-    </w:p>
-    <w:p>
-      <w:pPr>
-        <w:jc w:val="center"/>
-      </w:pPr>
-      <w:r>
-        <w:rPr>
-          <w:b w:val="0"/>
-          <w:sz w:val="22"/>
-        </w:rPr>
+        <w:drawing>
+          <wp:inline xmlns:a="http://schemas.openxmlformats.org/drawingml/2006/main" xmlns:pic="http://schemas.openxmlformats.org/drawingml/2006/picture">
+            <wp:extent cx="2160000" cy="1853617"/>
+            <wp:docPr id="1" name="Picture 1"/>
+            <wp:cNvGraphicFramePr>
+              <a:graphicFrameLocks noChangeAspect="1"/>
+            </wp:cNvGraphicFramePr>
+            <a:graphic>
+              <a:graphicData uri="http://schemas.openxmlformats.org/drawingml/2006/picture">
+                <pic:pic>
+                  <pic:nvPicPr>
+                    <pic:cNvPr id="0" name="adu_logo.png"/>
+                    <pic:cNvPicPr/>
+                  </pic:nvPicPr>
+                  <pic:blipFill>
+                    <a:blip r:embed="rId9"/>
+                    <a:stretch>
+                      <a:fillRect/>
+                    </a:stretch>
+                  </pic:blipFill>
+                  <pic:spPr>
+                    <a:xfrm>
+                      <a:off x="0" y="0"/>
+                      <a:ext cx="2160000" cy="1853617"/>
+                    </a:xfrm>
+                    <a:prstGeom prst="rect"/>
+                  </pic:spPr>
+                </pic:pic>
+              </a:graphicData>
+            </a:graphic>
+          </wp:inline>
+        </w:drawing>
       </w:r>
     </w:p>
     <w:p>
@@ -99,8 +112,6 @@
         <w:t>Encryption Modes and Error Propagation</w:t>
       </w:r>
     </w:p>
-    <w:p/>
-    <w:p/>
     <w:p/>
     <w:p/>
     <w:tbl>
@@ -478,7 +489,7 @@
         <w:drawing>
           <wp:inline xmlns:a="http://schemas.openxmlformats.org/drawingml/2006/main" xmlns:pic="http://schemas.openxmlformats.org/drawingml/2006/picture">
             <wp:extent cx="5760000" cy="2451793"/>
-            <wp:docPr id="1" name="Picture 1"/>
+            <wp:docPr id="2" name="Picture 2"/>
             <wp:cNvGraphicFramePr>
               <a:graphicFrameLocks noChangeAspect="1"/>
             </wp:cNvGraphicFramePr>
@@ -490,7 +501,7 @@
                     <pic:cNvPicPr/>
                   </pic:nvPicPr>
                   <pic:blipFill>
-                    <a:blip r:embed="rId11"/>
+                    <a:blip r:embed="rId12"/>
                     <a:stretch>
                       <a:fillRect/>
                     </a:stretch>
@@ -591,7 +602,7 @@
         <w:drawing>
           <wp:inline xmlns:a="http://schemas.openxmlformats.org/drawingml/2006/main" xmlns:pic="http://schemas.openxmlformats.org/drawingml/2006/picture">
             <wp:extent cx="5760000" cy="1346714"/>
-            <wp:docPr id="2" name="Picture 2"/>
+            <wp:docPr id="3" name="Picture 3"/>
             <wp:cNvGraphicFramePr>
               <a:graphicFrameLocks noChangeAspect="1"/>
             </wp:cNvGraphicFramePr>
@@ -603,7 +614,7 @@
                     <pic:cNvPicPr/>
                   </pic:nvPicPr>
                   <pic:blipFill>
-                    <a:blip r:embed="rId12"/>
+                    <a:blip r:embed="rId13"/>
                     <a:stretch>
                       <a:fillRect/>
                     </a:stretch>
@@ -685,7 +696,7 @@
         <w:drawing>
           <wp:inline xmlns:a="http://schemas.openxmlformats.org/drawingml/2006/main" xmlns:pic="http://schemas.openxmlformats.org/drawingml/2006/picture">
             <wp:extent cx="5760000" cy="1022485"/>
-            <wp:docPr id="3" name="Picture 3"/>
+            <wp:docPr id="4" name="Picture 4"/>
             <wp:cNvGraphicFramePr>
               <a:graphicFrameLocks noChangeAspect="1"/>
             </wp:cNvGraphicFramePr>
@@ -697,7 +708,7 @@
                     <pic:cNvPicPr/>
                   </pic:nvPicPr>
                   <pic:blipFill>
-                    <a:blip r:embed="rId13"/>
+                    <a:blip r:embed="rId14"/>
                     <a:stretch>
                       <a:fillRect/>
                     </a:stretch>
@@ -779,7 +790,7 @@
         <w:drawing>
           <wp:inline xmlns:a="http://schemas.openxmlformats.org/drawingml/2006/main" xmlns:pic="http://schemas.openxmlformats.org/drawingml/2006/picture">
             <wp:extent cx="5760000" cy="791706"/>
-            <wp:docPr id="4" name="Picture 4"/>
+            <wp:docPr id="5" name="Picture 5"/>
             <wp:cNvGraphicFramePr>
               <a:graphicFrameLocks noChangeAspect="1"/>
             </wp:cNvGraphicFramePr>
@@ -791,7 +802,7 @@
                     <pic:cNvPicPr/>
                   </pic:nvPicPr>
                   <pic:blipFill>
-                    <a:blip r:embed="rId14"/>
+                    <a:blip r:embed="rId15"/>
                     <a:stretch>
                       <a:fillRect/>
                     </a:stretch>
@@ -859,7 +870,7 @@
         <w:drawing>
           <wp:inline xmlns:a="http://schemas.openxmlformats.org/drawingml/2006/main" xmlns:pic="http://schemas.openxmlformats.org/drawingml/2006/picture">
             <wp:extent cx="5760000" cy="1060082"/>
-            <wp:docPr id="5" name="Picture 5"/>
+            <wp:docPr id="6" name="Picture 6"/>
             <wp:cNvGraphicFramePr>
               <a:graphicFrameLocks noChangeAspect="1"/>
             </wp:cNvGraphicFramePr>
@@ -871,7 +882,7 @@
                     <pic:cNvPicPr/>
                   </pic:nvPicPr>
                   <pic:blipFill>
-                    <a:blip r:embed="rId15"/>
+                    <a:blip r:embed="rId16"/>
                     <a:stretch>
                       <a:fillRect/>
                     </a:stretch>
@@ -999,7 +1010,7 @@
         <w:drawing>
           <wp:inline xmlns:a="http://schemas.openxmlformats.org/drawingml/2006/main" xmlns:pic="http://schemas.openxmlformats.org/drawingml/2006/picture">
             <wp:extent cx="3960000" cy="4020305"/>
-            <wp:docPr id="6" name="Picture 6"/>
+            <wp:docPr id="7" name="Picture 7"/>
             <wp:cNvGraphicFramePr>
               <a:graphicFrameLocks noChangeAspect="1"/>
             </wp:cNvGraphicFramePr>
@@ -1011,7 +1022,7 @@
                     <pic:cNvPicPr/>
                   </pic:nvPicPr>
                   <pic:blipFill>
-                    <a:blip r:embed="rId16"/>
+                    <a:blip r:embed="rId17"/>
                     <a:stretch>
                       <a:fillRect/>
                     </a:stretch>
@@ -1049,7 +1060,7 @@
         <w:drawing>
           <wp:inline xmlns:a="http://schemas.openxmlformats.org/drawingml/2006/main" xmlns:pic="http://schemas.openxmlformats.org/drawingml/2006/picture">
             <wp:extent cx="5760000" cy="2967939"/>
-            <wp:docPr id="7" name="Picture 7"/>
+            <wp:docPr id="8" name="Picture 8"/>
             <wp:cNvGraphicFramePr>
               <a:graphicFrameLocks noChangeAspect="1"/>
             </wp:cNvGraphicFramePr>
@@ -1061,7 +1072,7 @@
                     <pic:cNvPicPr/>
                   </pic:nvPicPr>
                   <pic:blipFill>
-                    <a:blip r:embed="rId17"/>
+                    <a:blip r:embed="rId18"/>
                     <a:stretch>
                       <a:fillRect/>
                     </a:stretch>
@@ -1644,7 +1655,7 @@
         <w:drawing>
           <wp:inline xmlns:a="http://schemas.openxmlformats.org/drawingml/2006/main" xmlns:pic="http://schemas.openxmlformats.org/drawingml/2006/picture">
             <wp:extent cx="5760000" cy="974850"/>
-            <wp:docPr id="8" name="Picture 8"/>
+            <wp:docPr id="9" name="Picture 9"/>
             <wp:cNvGraphicFramePr>
               <a:graphicFrameLocks noChangeAspect="1"/>
             </wp:cNvGraphicFramePr>
@@ -1656,7 +1667,7 @@
                     <pic:cNvPicPr/>
                   </pic:nvPicPr>
                   <pic:blipFill>
-                    <a:blip r:embed="rId18"/>
+                    <a:blip r:embed="rId19"/>
                     <a:stretch>
                       <a:fillRect/>
                     </a:stretch>
@@ -1738,7 +1749,7 @@
         <w:drawing>
           <wp:inline xmlns:a="http://schemas.openxmlformats.org/drawingml/2006/main" xmlns:pic="http://schemas.openxmlformats.org/drawingml/2006/picture">
             <wp:extent cx="5760000" cy="743683"/>
-            <wp:docPr id="9" name="Picture 9"/>
+            <wp:docPr id="10" name="Picture 10"/>
             <wp:cNvGraphicFramePr>
               <a:graphicFrameLocks noChangeAspect="1"/>
             </wp:cNvGraphicFramePr>
@@ -1750,7 +1761,7 @@
                     <pic:cNvPicPr/>
                   </pic:nvPicPr>
                   <pic:blipFill>
-                    <a:blip r:embed="rId19"/>
+                    <a:blip r:embed="rId20"/>
                     <a:stretch>
                       <a:fillRect/>
                     </a:stretch>
@@ -1865,7 +1876,7 @@
         <w:drawing>
           <wp:inline xmlns:a="http://schemas.openxmlformats.org/drawingml/2006/main" xmlns:pic="http://schemas.openxmlformats.org/drawingml/2006/picture">
             <wp:extent cx="5760000" cy="1175981"/>
-            <wp:docPr id="10" name="Picture 10"/>
+            <wp:docPr id="11" name="Picture 11"/>
             <wp:cNvGraphicFramePr>
               <a:graphicFrameLocks noChangeAspect="1"/>
             </wp:cNvGraphicFramePr>
@@ -1877,7 +1888,7 @@
                     <pic:cNvPicPr/>
                   </pic:nvPicPr>
                   <pic:blipFill>
-                    <a:blip r:embed="rId20"/>
+                    <a:blip r:embed="rId21"/>
                     <a:stretch>
                       <a:fillRect/>
                     </a:stretch>
@@ -2025,7 +2036,7 @@
         <w:drawing>
           <wp:inline xmlns:a="http://schemas.openxmlformats.org/drawingml/2006/main" xmlns:pic="http://schemas.openxmlformats.org/drawingml/2006/picture">
             <wp:extent cx="5760000" cy="951303"/>
-            <wp:docPr id="11" name="Picture 11"/>
+            <wp:docPr id="12" name="Picture 12"/>
             <wp:cNvGraphicFramePr>
               <a:graphicFrameLocks noChangeAspect="1"/>
             </wp:cNvGraphicFramePr>
@@ -2037,7 +2048,7 @@
                     <pic:cNvPicPr/>
                   </pic:nvPicPr>
                   <pic:blipFill>
-                    <a:blip r:embed="rId21"/>
+                    <a:blip r:embed="rId22"/>
                     <a:stretch>
                       <a:fillRect/>
                     </a:stretch>
@@ -3444,7 +3455,7 @@
         <w:drawing>
           <wp:inline xmlns:a="http://schemas.openxmlformats.org/drawingml/2006/main" xmlns:pic="http://schemas.openxmlformats.org/drawingml/2006/picture">
             <wp:extent cx="5760000" cy="3261728"/>
-            <wp:docPr id="12" name="Picture 12"/>
+            <wp:docPr id="13" name="Picture 13"/>
             <wp:cNvGraphicFramePr>
               <a:graphicFrameLocks noChangeAspect="1"/>
             </wp:cNvGraphicFramePr>
@@ -3456,7 +3467,7 @@
                     <pic:cNvPicPr/>
                   </pic:nvPicPr>
                   <pic:blipFill>
-                    <a:blip r:embed="rId22"/>
+                    <a:blip r:embed="rId23"/>
                     <a:stretch>
                       <a:fillRect/>
                     </a:stretch>
@@ -3686,7 +3697,7 @@
         <w:drawing>
           <wp:inline xmlns:a="http://schemas.openxmlformats.org/drawingml/2006/main" xmlns:pic="http://schemas.openxmlformats.org/drawingml/2006/picture">
             <wp:extent cx="5760000" cy="394753"/>
-            <wp:docPr id="13" name="Picture 13"/>
+            <wp:docPr id="14" name="Picture 14"/>
             <wp:cNvGraphicFramePr>
               <a:graphicFrameLocks noChangeAspect="1"/>
             </wp:cNvGraphicFramePr>
@@ -3698,7 +3709,7 @@
                     <pic:cNvPicPr/>
                   </pic:nvPicPr>
                   <pic:blipFill>
-                    <a:blip r:embed="rId23"/>
+                    <a:blip r:embed="rId24"/>
                     <a:stretch>
                       <a:fillRect/>
                     </a:stretch>
@@ -3766,7 +3777,7 @@
         <w:drawing>
           <wp:inline xmlns:a="http://schemas.openxmlformats.org/drawingml/2006/main" xmlns:pic="http://schemas.openxmlformats.org/drawingml/2006/picture">
             <wp:extent cx="5760000" cy="919293"/>
-            <wp:docPr id="14" name="Picture 14"/>
+            <wp:docPr id="15" name="Picture 15"/>
             <wp:cNvGraphicFramePr>
               <a:graphicFrameLocks noChangeAspect="1"/>
             </wp:cNvGraphicFramePr>
@@ -3778,7 +3789,7 @@
                     <pic:cNvPicPr/>
                   </pic:nvPicPr>
                   <pic:blipFill>
-                    <a:blip r:embed="rId24"/>
+                    <a:blip r:embed="rId25"/>
                     <a:stretch>
                       <a:fillRect/>
                     </a:stretch>
@@ -3846,7 +3857,7 @@
         <w:drawing>
           <wp:inline xmlns:a="http://schemas.openxmlformats.org/drawingml/2006/main" xmlns:pic="http://schemas.openxmlformats.org/drawingml/2006/picture">
             <wp:extent cx="5760000" cy="914446"/>
-            <wp:docPr id="15" name="Picture 15"/>
+            <wp:docPr id="16" name="Picture 16"/>
             <wp:cNvGraphicFramePr>
               <a:graphicFrameLocks noChangeAspect="1"/>
             </wp:cNvGraphicFramePr>
@@ -3858,7 +3869,7 @@
                     <pic:cNvPicPr/>
                   </pic:nvPicPr>
                   <pic:blipFill>
-                    <a:blip r:embed="rId25"/>
+                    <a:blip r:embed="rId26"/>
                     <a:stretch>
                       <a:fillRect/>
                     </a:stretch>
@@ -3937,7 +3948,7 @@
         <w:drawing>
           <wp:inline xmlns:a="http://schemas.openxmlformats.org/drawingml/2006/main" xmlns:pic="http://schemas.openxmlformats.org/drawingml/2006/picture">
             <wp:extent cx="5760000" cy="414610"/>
-            <wp:docPr id="16" name="Picture 16"/>
+            <wp:docPr id="17" name="Picture 17"/>
             <wp:cNvGraphicFramePr>
               <a:graphicFrameLocks noChangeAspect="1"/>
             </wp:cNvGraphicFramePr>
@@ -3949,7 +3960,7 @@
                     <pic:cNvPicPr/>
                   </pic:nvPicPr>
                   <pic:blipFill>
-                    <a:blip r:embed="rId26"/>
+                    <a:blip r:embed="rId27"/>
                     <a:stretch>
                       <a:fillRect/>
                     </a:stretch>
@@ -3998,7 +4009,7 @@
         <w:drawing>
           <wp:inline xmlns:a="http://schemas.openxmlformats.org/drawingml/2006/main" xmlns:pic="http://schemas.openxmlformats.org/drawingml/2006/picture">
             <wp:extent cx="5760000" cy="829602"/>
-            <wp:docPr id="17" name="Picture 17"/>
+            <wp:docPr id="18" name="Picture 18"/>
             <wp:cNvGraphicFramePr>
               <a:graphicFrameLocks noChangeAspect="1"/>
             </wp:cNvGraphicFramePr>
@@ -4010,7 +4021,7 @@
                     <pic:cNvPicPr/>
                   </pic:nvPicPr>
                   <pic:blipFill>
-                    <a:blip r:embed="rId27"/>
+                    <a:blip r:embed="rId28"/>
                     <a:stretch>
                       <a:fillRect/>
                     </a:stretch>
@@ -4067,7 +4078,7 @@
         <w:drawing>
           <wp:inline xmlns:a="http://schemas.openxmlformats.org/drawingml/2006/main" xmlns:pic="http://schemas.openxmlformats.org/drawingml/2006/picture">
             <wp:extent cx="5760000" cy="945396"/>
-            <wp:docPr id="18" name="Picture 18"/>
+            <wp:docPr id="19" name="Picture 19"/>
             <wp:cNvGraphicFramePr>
               <a:graphicFrameLocks noChangeAspect="1"/>
             </wp:cNvGraphicFramePr>
@@ -4079,7 +4090,7 @@
                     <pic:cNvPicPr/>
                   </pic:nvPicPr>
                   <pic:blipFill>
-                    <a:blip r:embed="rId28"/>
+                    <a:blip r:embed="rId29"/>
                     <a:stretch>
                       <a:fillRect/>
                     </a:stretch>
@@ -4560,7 +4571,7 @@
         <w:drawing>
           <wp:inline xmlns:a="http://schemas.openxmlformats.org/drawingml/2006/main" xmlns:pic="http://schemas.openxmlformats.org/drawingml/2006/picture">
             <wp:extent cx="5760000" cy="402416"/>
-            <wp:docPr id="19" name="Picture 19"/>
+            <wp:docPr id="20" name="Picture 20"/>
             <wp:cNvGraphicFramePr>
               <a:graphicFrameLocks noChangeAspect="1"/>
             </wp:cNvGraphicFramePr>
@@ -4572,7 +4583,7 @@
                     <pic:cNvPicPr/>
                   </pic:nvPicPr>
                   <pic:blipFill>
-                    <a:blip r:embed="rId29"/>
+                    <a:blip r:embed="rId30"/>
                     <a:stretch>
                       <a:fillRect/>
                     </a:stretch>
@@ -4675,7 +4686,7 @@
         <w:drawing>
           <wp:inline xmlns:a="http://schemas.openxmlformats.org/drawingml/2006/main" xmlns:pic="http://schemas.openxmlformats.org/drawingml/2006/picture">
             <wp:extent cx="5760000" cy="1095765"/>
-            <wp:docPr id="20" name="Picture 20"/>
+            <wp:docPr id="21" name="Picture 21"/>
             <wp:cNvGraphicFramePr>
               <a:graphicFrameLocks noChangeAspect="1"/>
             </wp:cNvGraphicFramePr>
@@ -4687,7 +4698,7 @@
                     <pic:cNvPicPr/>
                   </pic:nvPicPr>
                   <pic:blipFill>
-                    <a:blip r:embed="rId30"/>
+                    <a:blip r:embed="rId31"/>
                     <a:stretch>
                       <a:fillRect/>
                     </a:stretch>
@@ -4755,7 +4766,7 @@
         <w:drawing>
           <wp:inline xmlns:a="http://schemas.openxmlformats.org/drawingml/2006/main" xmlns:pic="http://schemas.openxmlformats.org/drawingml/2006/picture">
             <wp:extent cx="5760000" cy="1471390"/>
-            <wp:docPr id="21" name="Picture 21"/>
+            <wp:docPr id="22" name="Picture 22"/>
             <wp:cNvGraphicFramePr>
               <a:graphicFrameLocks noChangeAspect="1"/>
             </wp:cNvGraphicFramePr>
@@ -4767,7 +4778,7 @@
                     <pic:cNvPicPr/>
                   </pic:nvPicPr>
                   <pic:blipFill>
-                    <a:blip r:embed="rId31"/>
+                    <a:blip r:embed="rId32"/>
                     <a:stretch>
                       <a:fillRect/>
                     </a:stretch>
@@ -4805,7 +4816,7 @@
         <w:drawing>
           <wp:inline xmlns:a="http://schemas.openxmlformats.org/drawingml/2006/main" xmlns:pic="http://schemas.openxmlformats.org/drawingml/2006/picture">
             <wp:extent cx="5760000" cy="1237333"/>
-            <wp:docPr id="22" name="Picture 22"/>
+            <wp:docPr id="23" name="Picture 23"/>
             <wp:cNvGraphicFramePr>
               <a:graphicFrameLocks noChangeAspect="1"/>
             </wp:cNvGraphicFramePr>
@@ -4817,7 +4828,7 @@
                     <pic:cNvPicPr/>
                   </pic:nvPicPr>
                   <pic:blipFill>
-                    <a:blip r:embed="rId32"/>
+                    <a:blip r:embed="rId33"/>
                     <a:stretch>
                       <a:fillRect/>
                     </a:stretch>
@@ -4855,7 +4866,7 @@
         <w:drawing>
           <wp:inline xmlns:a="http://schemas.openxmlformats.org/drawingml/2006/main" xmlns:pic="http://schemas.openxmlformats.org/drawingml/2006/picture">
             <wp:extent cx="5760000" cy="1347832"/>
-            <wp:docPr id="23" name="Picture 23"/>
+            <wp:docPr id="24" name="Picture 24"/>
             <wp:cNvGraphicFramePr>
               <a:graphicFrameLocks noChangeAspect="1"/>
             </wp:cNvGraphicFramePr>
@@ -4867,7 +4878,7 @@
                     <pic:cNvPicPr/>
                   </pic:nvPicPr>
                   <pic:blipFill>
-                    <a:blip r:embed="rId33"/>
+                    <a:blip r:embed="rId34"/>
                     <a:stretch>
                       <a:fillRect/>
                     </a:stretch>
@@ -5479,7 +5490,7 @@
         <w:drawing>
           <wp:inline xmlns:a="http://schemas.openxmlformats.org/drawingml/2006/main" xmlns:pic="http://schemas.openxmlformats.org/drawingml/2006/picture">
             <wp:extent cx="5760000" cy="1211569"/>
-            <wp:docPr id="24" name="Picture 24"/>
+            <wp:docPr id="25" name="Picture 25"/>
             <wp:cNvGraphicFramePr>
               <a:graphicFrameLocks noChangeAspect="1"/>
             </wp:cNvGraphicFramePr>
@@ -5491,7 +5502,7 @@
                     <pic:cNvPicPr/>
                   </pic:nvPicPr>
                   <pic:blipFill>
-                    <a:blip r:embed="rId34"/>
+                    <a:blip r:embed="rId35"/>
                     <a:stretch>
                       <a:fillRect/>
                     </a:stretch>
@@ -5537,7 +5548,7 @@
         <w:drawing>
           <wp:inline xmlns:a="http://schemas.openxmlformats.org/drawingml/2006/main" xmlns:pic="http://schemas.openxmlformats.org/drawingml/2006/picture">
             <wp:extent cx="5760000" cy="1166081"/>
-            <wp:docPr id="25" name="Picture 25"/>
+            <wp:docPr id="26" name="Picture 26"/>
             <wp:cNvGraphicFramePr>
               <a:graphicFrameLocks noChangeAspect="1"/>
             </wp:cNvGraphicFramePr>
@@ -5549,7 +5560,7 @@
                     <pic:cNvPicPr/>
                   </pic:nvPicPr>
                   <pic:blipFill>
-                    <a:blip r:embed="rId35"/>
+                    <a:blip r:embed="rId36"/>
                     <a:stretch>
                       <a:fillRect/>
                     </a:stretch>
@@ -5617,7 +5628,7 @@
         <w:drawing>
           <wp:inline xmlns:a="http://schemas.openxmlformats.org/drawingml/2006/main" xmlns:pic="http://schemas.openxmlformats.org/drawingml/2006/picture">
             <wp:extent cx="5760000" cy="1354030"/>
-            <wp:docPr id="26" name="Picture 26"/>
+            <wp:docPr id="27" name="Picture 27"/>
             <wp:cNvGraphicFramePr>
               <a:graphicFrameLocks noChangeAspect="1"/>
             </wp:cNvGraphicFramePr>
@@ -5629,7 +5640,7 @@
                     <pic:cNvPicPr/>
                   </pic:nvPicPr>
                   <pic:blipFill>
-                    <a:blip r:embed="rId36"/>
+                    <a:blip r:embed="rId37"/>
                     <a:stretch>
                       <a:fillRect/>
                     </a:stretch>
@@ -5678,7 +5689,7 @@
         <w:drawing>
           <wp:inline xmlns:a="http://schemas.openxmlformats.org/drawingml/2006/main" xmlns:pic="http://schemas.openxmlformats.org/drawingml/2006/picture">
             <wp:extent cx="5760000" cy="2408276"/>
-            <wp:docPr id="27" name="Picture 27"/>
+            <wp:docPr id="28" name="Picture 28"/>
             <wp:cNvGraphicFramePr>
               <a:graphicFrameLocks noChangeAspect="1"/>
             </wp:cNvGraphicFramePr>
@@ -5690,7 +5701,7 @@
                     <pic:cNvPicPr/>
                   </pic:nvPicPr>
                   <pic:blipFill>
-                    <a:blip r:embed="rId37"/>
+                    <a:blip r:embed="rId38"/>
                     <a:stretch>
                       <a:fillRect/>
                     </a:stretch>
@@ -5739,7 +5750,7 @@
         <w:drawing>
           <wp:inline xmlns:a="http://schemas.openxmlformats.org/drawingml/2006/main" xmlns:pic="http://schemas.openxmlformats.org/drawingml/2006/picture">
             <wp:extent cx="5760000" cy="1030872"/>
-            <wp:docPr id="28" name="Picture 28"/>
+            <wp:docPr id="29" name="Picture 29"/>
             <wp:cNvGraphicFramePr>
               <a:graphicFrameLocks noChangeAspect="1"/>
             </wp:cNvGraphicFramePr>
@@ -5751,7 +5762,7 @@
                     <pic:cNvPicPr/>
                   </pic:nvPicPr>
                   <pic:blipFill>
-                    <a:blip r:embed="rId38"/>
+                    <a:blip r:embed="rId39"/>
                     <a:stretch>
                       <a:fillRect/>
                     </a:stretch>
@@ -6139,7 +6150,7 @@
         <w:drawing>
           <wp:inline xmlns:a="http://schemas.openxmlformats.org/drawingml/2006/main" xmlns:pic="http://schemas.openxmlformats.org/drawingml/2006/picture">
             <wp:extent cx="5760000" cy="1402553"/>
-            <wp:docPr id="29" name="Picture 29"/>
+            <wp:docPr id="30" name="Picture 30"/>
             <wp:cNvGraphicFramePr>
               <a:graphicFrameLocks noChangeAspect="1"/>
             </wp:cNvGraphicFramePr>
@@ -6151,7 +6162,7 @@
                     <pic:cNvPicPr/>
                   </pic:nvPicPr>
                   <pic:blipFill>
-                    <a:blip r:embed="rId39"/>
+                    <a:blip r:embed="rId40"/>
                     <a:stretch>
                       <a:fillRect/>
                     </a:stretch>
@@ -6189,7 +6200,7 @@
         <w:drawing>
           <wp:inline xmlns:a="http://schemas.openxmlformats.org/drawingml/2006/main" xmlns:pic="http://schemas.openxmlformats.org/drawingml/2006/picture">
             <wp:extent cx="5760000" cy="2642703"/>
-            <wp:docPr id="30" name="Picture 30"/>
+            <wp:docPr id="31" name="Picture 31"/>
             <wp:cNvGraphicFramePr>
               <a:graphicFrameLocks noChangeAspect="1"/>
             </wp:cNvGraphicFramePr>
@@ -6201,7 +6212,7 @@
                     <pic:cNvPicPr/>
                   </pic:nvPicPr>
                   <pic:blipFill>
-                    <a:blip r:embed="rId40"/>
+                    <a:blip r:embed="rId41"/>
                     <a:stretch>
                       <a:fillRect/>
                     </a:stretch>
@@ -6842,8 +6853,8 @@
       </w:r>
     </w:p>
     <w:sectPr>
-      <w:headerReference w:type="default" r:id="rId9"/>
-      <w:footerReference w:type="default" r:id="rId10"/>
+      <w:headerReference w:type="default" r:id="rId10"/>
+      <w:footerReference w:type="default" r:id="rId11"/>
       <w:pgSz w:w="11906" w:h="16838"/>
       <w:pgMar w:top="1247" w:right="1417" w:bottom="1247" w:left="1417" w:header="720" w:footer="720" w:gutter="0"/>
       <w:cols w:space="720"/>

</xml_diff>

<commit_message>
Fill in section and instructor on front page
Co-Authored-By: Claude Opus 5.5 <noreply@anthropic.com>
Claude-Session: https://claude.ai/code/session_015FzNpWvVcgtCUNTKwZzDr2
</commit_message>
<xml_diff>
--- a/lab2_report/ITE408_Lab2_Report_1093911.docx
+++ b/lab2_report/ITE408_Lab2_Report_1093911.docx
@@ -228,7 +228,7 @@
           </w:tcPr>
           <w:p>
             <w:r>
-              <w:t>[Section]</w:t>
+              <w:t>103</w:t>
             </w:r>
           </w:p>
         </w:tc>
@@ -255,7 +255,7 @@
           </w:tcPr>
           <w:p>
             <w:r>
-              <w:t>[Instructor Name]</w:t>
+              <w:t>Dr. Abid Mehmmood</w:t>
             </w:r>
           </w:p>
         </w:tc>

</xml_diff>

<commit_message>
Replace inconsistent Task 5 result figures with one clean run
Co-Authored-By: Claude Opus 5.5 <noreply@anthropic.com>
Claude-Session: https://claude.ai/code/session_015FzNpWvVcgtCUNTKwZzDr2
</commit_message>
<xml_diff>
--- a/lab2_report/ITE408_Lab2_Report_1093911.docx
+++ b/lab2_report/ITE408_Lab2_Report_1093911.docx
@@ -5737,7 +5737,57 @@
         <w:rPr>
           <w:b w:val="0"/>
         </w:rPr>
-        <w:t>When I tried to edit and save the file in GHex, the change was not written to the file (I checked with xxd and the byte was still b7). The first decryption of all four files gave 0 different bytes, which confirmed that the files were not changed yet. Because of this I flipped the bit with a short Python command instead. It reads the file, XORs byte 54 with 1 (this flips only the lowest bit), and writes it back. It does exactly the same thing as changing B7 to B6 in a hex editor.</w:t>
+        <w:t>When I tried to edit and save ecb.bin in GHex, the change was not written to the file. When I decrypted all four files at that point, every mode gave 0 different bytes, which showed that the files were still not corrupted (Figure 28). Because of this I flipped the bit with a short Python command instead. It reads the file, XORs byte 54 with 1 (this flips only the lowest bit), and writes it back. It does exactly the same thing as changing B7 to B6 in a hex editor.</w:t>
+      </w:r>
+    </w:p>
+    <w:p>
+      <w:pPr>
+        <w:keepNext/>
+        <w:spacing w:after="40"/>
+        <w:jc w:val="center"/>
+      </w:pPr>
+      <w:r>
+        <w:drawing>
+          <wp:inline xmlns:a="http://schemas.openxmlformats.org/drawingml/2006/main" xmlns:pic="http://schemas.openxmlformats.org/drawingml/2006/picture">
+            <wp:extent cx="5760000" cy="2786549"/>
+            <wp:docPr id="29" name="Picture 29"/>
+            <wp:cNvGraphicFramePr>
+              <a:graphicFrameLocks noChangeAspect="1"/>
+            </wp:cNvGraphicFramePr>
+            <a:graphic>
+              <a:graphicData uri="http://schemas.openxmlformats.org/drawingml/2006/picture">
+                <pic:pic>
+                  <pic:nvPicPr>
+                    <pic:cNvPr id="0" name="27_first_run.png"/>
+                    <pic:cNvPicPr/>
+                  </pic:nvPicPr>
+                  <pic:blipFill>
+                    <a:blip r:embed="rId39"/>
+                    <a:stretch>
+                      <a:fillRect/>
+                    </a:stretch>
+                  </pic:blipFill>
+                  <pic:spPr>
+                    <a:xfrm>
+                      <a:off x="0" y="0"/>
+                      <a:ext cx="5760000" cy="2786549"/>
+                    </a:xfrm>
+                    <a:prstGeom prst="rect"/>
+                  </pic:spPr>
+                </pic:pic>
+              </a:graphicData>
+            </a:graphic>
+          </wp:inline>
+        </w:drawing>
+      </w:r>
+    </w:p>
+    <w:p>
+      <w:pPr>
+        <w:pStyle w:val="Caption"/>
+        <w:jc w:val="center"/>
+      </w:pPr>
+      <w:r>
+        <w:t>Figure 28: First decryption attempt – 0 bytes differ because the files were not corrupted yet</w:t>
       </w:r>
     </w:p>
     <w:p>
@@ -5750,7 +5800,7 @@
         <w:drawing>
           <wp:inline xmlns:a="http://schemas.openxmlformats.org/drawingml/2006/main" xmlns:pic="http://schemas.openxmlformats.org/drawingml/2006/picture">
             <wp:extent cx="5760000" cy="1030872"/>
-            <wp:docPr id="29" name="Picture 29"/>
+            <wp:docPr id="30" name="Picture 30"/>
             <wp:cNvGraphicFramePr>
               <a:graphicFrameLocks noChangeAspect="1"/>
             </wp:cNvGraphicFramePr>
@@ -5762,7 +5812,7 @@
                     <pic:cNvPicPr/>
                   </pic:nvPicPr>
                   <pic:blipFill>
-                    <a:blip r:embed="rId39"/>
+                    <a:blip r:embed="rId40"/>
                     <a:stretch>
                       <a:fillRect/>
                     </a:stretch>
@@ -5787,7 +5837,7 @@
         <w:jc w:val="center"/>
       </w:pPr>
       <w:r>
-        <w:t>Figure 28: Checking the corrupted byte (offset 0x36) and the file sizes of all four files</w:t>
+        <w:t>Figure 29: Checking the corrupted byte (offset 0x36) and the file sizes of all four files</w:t>
       </w:r>
     </w:p>
     <w:tbl>
@@ -6137,7 +6187,7 @@
         <w:rPr>
           <w:b w:val="0"/>
         </w:rPr>
-        <w:t>I decrypted each file with the correct key and IV, and used cmp -l to count how many bytes are different from the original plain.txt. I also printed the first lines with cat -v so the non-printable characters can be seen.</w:t>
+        <w:t>After all four files were corrupted, I checked the byte at offset 0x36 again and decrypted each file with the correct key and IV. Then I used cmp -l to count how many bytes are different from the original plain.txt, and printed the first lines with cat -v so the non-printable characters can be seen.</w:t>
       </w:r>
     </w:p>
     <w:p>
@@ -6149,8 +6199,8 @@
       <w:r>
         <w:drawing>
           <wp:inline xmlns:a="http://schemas.openxmlformats.org/drawingml/2006/main" xmlns:pic="http://schemas.openxmlformats.org/drawingml/2006/picture">
-            <wp:extent cx="5760000" cy="1402553"/>
-            <wp:docPr id="30" name="Picture 30"/>
+            <wp:extent cx="5760000" cy="1013760"/>
+            <wp:docPr id="31" name="Picture 31"/>
             <wp:cNvGraphicFramePr>
               <a:graphicFrameLocks noChangeAspect="1"/>
             </wp:cNvGraphicFramePr>
@@ -6158,11 +6208,11 @@
               <a:graphicData uri="http://schemas.openxmlformats.org/drawingml/2006/picture">
                 <pic:pic>
                   <pic:nvPicPr>
-                    <pic:cNvPr id="0" name="30.png"/>
+                    <pic:cNvPr id="0" name="t5_decrypt.png"/>
                     <pic:cNvPicPr/>
                   </pic:nvPicPr>
                   <pic:blipFill>
-                    <a:blip r:embed="rId40"/>
+                    <a:blip r:embed="rId41"/>
                     <a:stretch>
                       <a:fillRect/>
                     </a:stretch>
@@ -6170,7 +6220,7 @@
                   <pic:spPr>
                     <a:xfrm>
                       <a:off x="0" y="0"/>
-                      <a:ext cx="5760000" cy="1402553"/>
+                      <a:ext cx="5760000" cy="1013760"/>
                     </a:xfrm>
                     <a:prstGeom prst="rect"/>
                   </pic:spPr>
@@ -6187,7 +6237,7 @@
         <w:jc w:val="center"/>
       </w:pPr>
       <w:r>
-        <w:t>Figure 29: ECB – bit flip and decryption result</w:t>
+        <w:t>Figure 30: Checking the corrupted bytes and decrypting the four files</w:t>
       </w:r>
     </w:p>
     <w:p>
@@ -6199,8 +6249,8 @@
       <w:r>
         <w:drawing>
           <wp:inline xmlns:a="http://schemas.openxmlformats.org/drawingml/2006/main" xmlns:pic="http://schemas.openxmlformats.org/drawingml/2006/picture">
-            <wp:extent cx="5760000" cy="2642703"/>
-            <wp:docPr id="31" name="Picture 31"/>
+            <wp:extent cx="3960000" cy="3853756"/>
+            <wp:docPr id="32" name="Picture 32"/>
             <wp:cNvGraphicFramePr>
               <a:graphicFrameLocks noChangeAspect="1"/>
             </wp:cNvGraphicFramePr>
@@ -6208,11 +6258,11 @@
               <a:graphicData uri="http://schemas.openxmlformats.org/drawingml/2006/picture">
                 <pic:pic>
                   <pic:nvPicPr>
-                    <pic:cNvPr id="0" name="28.png"/>
+                    <pic:cNvPr id="0" name="t5_results.png"/>
                     <pic:cNvPicPr/>
                   </pic:nvPicPr>
                   <pic:blipFill>
-                    <a:blip r:embed="rId41"/>
+                    <a:blip r:embed="rId42"/>
                     <a:stretch>
                       <a:fillRect/>
                     </a:stretch>
@@ -6220,7 +6270,7 @@
                   <pic:spPr>
                     <a:xfrm>
                       <a:off x="0" y="0"/>
-                      <a:ext cx="5760000" cy="2642703"/>
+                      <a:ext cx="3960000" cy="3853756"/>
                     </a:xfrm>
                     <a:prstGeom prst="rect"/>
                   </pic:spPr>
@@ -6237,7 +6287,7 @@
         <w:jc w:val="center"/>
       </w:pPr>
       <w:r>
-        <w:t>Figure 30: CBC, CFB and OFB decryption results</w:t>
+        <w:t>Figure 31: Decryption results for ECB, CBC, CFB and OFB</w:t>
       </w:r>
     </w:p>
     <w:p>

</xml_diff>